<commit_message>
Add vcfo as booth sponsor (site, timer, workbook, deck, QR)
</commit_message>
<xml_diff>
--- a/deliverables/workbook/Workbook.docx
+++ b/deliverables/workbook/Workbook.docx
@@ -14921,7 +14921,7 @@
                       <wp:inline distT="0" distB="0" distL="0" distR="0">
                         <wp:extent cx="419100" cy="419100"/>
                         <wp:effectExtent t="0" r="0" b="0" l="0"/>
-                        <wp:docPr id="1" name="img" descr="image" title="host-eosnorthtexas.png"/>
+                        <wp:docPr id="1" name="img" descr="image" title="sponsor-north-texas-eos-implementers.png"/>
                         <wp:cNvGraphicFramePr>
                           <a:graphicFrameLocks xmlns:a="http://schemas.openxmlformats.org/drawingml/2006/main" noChangeAspect="1"/>
                         </wp:cNvGraphicFramePr>
@@ -16265,10 +16265,11 @@
         </w:tblBorders>
       </w:tblPr>
       <w:tblGrid>
-        <w:gridCol w:w="2520"/>
-        <w:gridCol w:w="2520"/>
-        <w:gridCol w:w="2520"/>
-        <w:gridCol w:w="2520"/>
+        <w:gridCol w:w="2016"/>
+        <w:gridCol w:w="2016"/>
+        <w:gridCol w:w="2016"/>
+        <w:gridCol w:w="2016"/>
+        <w:gridCol w:w="2016"/>
       </w:tblGrid>
       <w:tr>
         <w:trPr>
@@ -16276,7 +16277,7 @@
         </w:trPr>
         <w:tc>
           <w:tcPr>
-            <w:tcW w:type="dxa" w:w="2520"/>
+            <w:tcW w:type="dxa" w:w="2016"/>
             <w:tcBorders>
               <w:top w:val="single" w:color="C9D2DE" w:sz="4"/>
               <w:left w:val="single" w:color="C9D2DE" w:sz="4"/>
@@ -16294,7 +16295,7 @@
           </w:tcPr>
           <w:tbl>
             <w:tblPr>
-              <w:tblW w:type="dxa" w:w="2200"/>
+              <w:tblW w:type="dxa" w:w="1696"/>
               <w:tblBorders>
                 <w:top w:val="single" w:color="auto" w:sz="4"/>
                 <w:left w:val="single" w:color="auto" w:sz="4"/>
@@ -16305,7 +16306,7 @@
               </w:tblBorders>
             </w:tblPr>
             <w:tblGrid>
-              <w:gridCol w:w="1650"/>
+              <w:gridCol w:w="1146"/>
               <w:gridCol w:w="870"/>
             </w:tblGrid>
             <w:tr>
@@ -16314,7 +16315,7 @@
               </w:trPr>
               <w:tc>
                 <w:tcPr>
-                  <w:tcW w:type="dxa" w:w="1650"/>
+                  <w:tcW w:type="dxa" w:w="1146"/>
                   <w:tcBorders>
                     <w:top w:val="none" w:color="FFFFFF" w:sz="0"/>
                     <w:left w:val="none" w:color="FFFFFF" w:sz="0"/>
@@ -16337,7 +16338,7 @@
                   <w:r>
                     <w:drawing>
                       <wp:inline distT="0" distB="0" distL="0" distR="0">
-                        <wp:extent cx="819150" cy="314325"/>
+                        <wp:extent cx="495300" cy="190500"/>
                         <wp:effectExtent t="0" r="0" b="0" l="0"/>
                         <wp:docPr id="1" name="img" descr="image" title="360consultingdfw.png"/>
                         <wp:cNvGraphicFramePr>
@@ -16362,7 +16363,7 @@
                               <pic:spPr bwMode="auto">
                                 <a:xfrm>
                                   <a:off x="0" y="0"/>
-                                  <a:ext cx="819150" cy="314325"/>
+                                  <a:ext cx="495300" cy="190500"/>
                                 </a:xfrm>
                                 <a:prstGeom prst="rect">
                                   <a:avLst/>
@@ -16463,7 +16464,7 @@
         </w:tc>
         <w:tc>
           <w:tcPr>
-            <w:tcW w:type="dxa" w:w="2520"/>
+            <w:tcW w:type="dxa" w:w="2016"/>
             <w:tcBorders>
               <w:top w:val="single" w:color="C9D2DE" w:sz="4"/>
               <w:left w:val="single" w:color="C9D2DE" w:sz="4"/>
@@ -16481,7 +16482,7 @@
           </w:tcPr>
           <w:tbl>
             <w:tblPr>
-              <w:tblW w:type="dxa" w:w="2200"/>
+              <w:tblW w:type="dxa" w:w="1696"/>
               <w:tblBorders>
                 <w:top w:val="single" w:color="auto" w:sz="4"/>
                 <w:left w:val="single" w:color="auto" w:sz="4"/>
@@ -16492,7 +16493,7 @@
               </w:tblBorders>
             </w:tblPr>
             <w:tblGrid>
-              <w:gridCol w:w="1650"/>
+              <w:gridCol w:w="1146"/>
               <w:gridCol w:w="870"/>
             </w:tblGrid>
             <w:tr>
@@ -16501,7 +16502,7 @@
               </w:trPr>
               <w:tc>
                 <w:tcPr>
-                  <w:tcW w:type="dxa" w:w="1650"/>
+                  <w:tcW w:type="dxa" w:w="1146"/>
                   <w:tcBorders>
                     <w:top w:val="none" w:color="FFFFFF" w:sz="0"/>
                     <w:left w:val="none" w:color="FFFFFF" w:sz="0"/>
@@ -16524,7 +16525,7 @@
                   <w:r>
                     <w:drawing>
                       <wp:inline distT="0" distB="0" distL="0" distR="0">
-                        <wp:extent cx="628650" cy="381000"/>
+                        <wp:extent cx="495300" cy="295275"/>
                         <wp:effectExtent t="0" r="0" b="0" l="0"/>
                         <wp:docPr id="1" name="img" descr="image" title="allinoneaccounting.png"/>
                         <wp:cNvGraphicFramePr>
@@ -16549,7 +16550,7 @@
                               <pic:spPr bwMode="auto">
                                 <a:xfrm>
                                   <a:off x="0" y="0"/>
-                                  <a:ext cx="628650" cy="381000"/>
+                                  <a:ext cx="495300" cy="295275"/>
                                 </a:xfrm>
                                 <a:prstGeom prst="rect">
                                   <a:avLst/>
@@ -16650,7 +16651,7 @@
         </w:tc>
         <w:tc>
           <w:tcPr>
-            <w:tcW w:type="dxa" w:w="2520"/>
+            <w:tcW w:type="dxa" w:w="2016"/>
             <w:tcBorders>
               <w:top w:val="single" w:color="C9D2DE" w:sz="4"/>
               <w:left w:val="single" w:color="C9D2DE" w:sz="4"/>
@@ -16668,7 +16669,7 @@
           </w:tcPr>
           <w:tbl>
             <w:tblPr>
-              <w:tblW w:type="dxa" w:w="2200"/>
+              <w:tblW w:type="dxa" w:w="1696"/>
               <w:tblBorders>
                 <w:top w:val="single" w:color="auto" w:sz="4"/>
                 <w:left w:val="single" w:color="auto" w:sz="4"/>
@@ -16679,7 +16680,7 @@
               </w:tblBorders>
             </w:tblPr>
             <w:tblGrid>
-              <w:gridCol w:w="1650"/>
+              <w:gridCol w:w="1146"/>
               <w:gridCol w:w="870"/>
             </w:tblGrid>
             <w:tr>
@@ -16688,7 +16689,7 @@
               </w:trPr>
               <w:tc>
                 <w:tcPr>
-                  <w:tcW w:type="dxa" w:w="1650"/>
+                  <w:tcW w:type="dxa" w:w="1146"/>
                   <w:tcBorders>
                     <w:top w:val="none" w:color="FFFFFF" w:sz="0"/>
                     <w:left w:val="none" w:color="FFFFFF" w:sz="0"/>
@@ -16711,7 +16712,7 @@
                   <w:r>
                     <w:drawing>
                       <wp:inline distT="0" distB="0" distL="0" distR="0">
-                        <wp:extent cx="819150" cy="123825"/>
+                        <wp:extent cx="495300" cy="76200"/>
                         <wp:effectExtent t="0" r="0" b="0" l="0"/>
                         <wp:docPr id="1" name="img" descr="image" title="chiefaiofficer.png"/>
                         <wp:cNvGraphicFramePr>
@@ -16736,7 +16737,7 @@
                               <pic:spPr bwMode="auto">
                                 <a:xfrm>
                                   <a:off x="0" y="0"/>
-                                  <a:ext cx="819150" cy="123825"/>
+                                  <a:ext cx="495300" cy="76200"/>
                                 </a:xfrm>
                                 <a:prstGeom prst="rect">
                                   <a:avLst/>
@@ -16837,7 +16838,7 @@
         </w:tc>
         <w:tc>
           <w:tcPr>
-            <w:tcW w:type="dxa" w:w="2520"/>
+            <w:tcW w:type="dxa" w:w="2016"/>
             <w:tcBorders>
               <w:top w:val="single" w:color="C9D2DE" w:sz="4"/>
               <w:left w:val="single" w:color="C9D2DE" w:sz="4"/>
@@ -16855,7 +16856,7 @@
           </w:tcPr>
           <w:tbl>
             <w:tblPr>
-              <w:tblW w:type="dxa" w:w="2200"/>
+              <w:tblW w:type="dxa" w:w="1696"/>
               <w:tblBorders>
                 <w:top w:val="single" w:color="auto" w:sz="4"/>
                 <w:left w:val="single" w:color="auto" w:sz="4"/>
@@ -16866,7 +16867,7 @@
               </w:tblBorders>
             </w:tblPr>
             <w:tblGrid>
-              <w:gridCol w:w="1650"/>
+              <w:gridCol w:w="1146"/>
               <w:gridCol w:w="870"/>
             </w:tblGrid>
             <w:tr>
@@ -16875,7 +16876,7 @@
               </w:trPr>
               <w:tc>
                 <w:tcPr>
-                  <w:tcW w:type="dxa" w:w="1650"/>
+                  <w:tcW w:type="dxa" w:w="1146"/>
                   <w:tcBorders>
                     <w:top w:val="none" w:color="FFFFFF" w:sz="0"/>
                     <w:left w:val="none" w:color="FFFFFF" w:sz="0"/>
@@ -16898,7 +16899,7 @@
                   <w:r>
                     <w:drawing>
                       <wp:inline distT="0" distB="0" distL="0" distR="0">
-                        <wp:extent cx="809625" cy="381000"/>
+                        <wp:extent cx="495300" cy="238125"/>
                         <wp:effectExtent t="0" r="0" b="0" l="0"/>
                         <wp:docPr id="1" name="img" descr="image" title="hoopshr.png"/>
                         <wp:cNvGraphicFramePr>
@@ -16923,7 +16924,7 @@
                               <pic:spPr bwMode="auto">
                                 <a:xfrm>
                                   <a:off x="0" y="0"/>
-                                  <a:ext cx="809625" cy="381000"/>
+                                  <a:ext cx="495300" cy="238125"/>
                                 </a:xfrm>
                                 <a:prstGeom prst="rect">
                                   <a:avLst/>
@@ -17022,14 +17023,9 @@
           </w:tbl>
           <w:p/>
         </w:tc>
-      </w:tr>
-      <w:tr>
-        <w:trPr>
-          <w:cantSplit/>
-        </w:trPr>
-        <w:tc>
-          <w:tcPr>
-            <w:tcW w:type="dxa" w:w="2520"/>
+        <w:tc>
+          <w:tcPr>
+            <w:tcW w:type="dxa" w:w="2016"/>
             <w:tcBorders>
               <w:top w:val="single" w:color="C9D2DE" w:sz="4"/>
               <w:left w:val="single" w:color="C9D2DE" w:sz="4"/>
@@ -17047,7 +17043,7 @@
           </w:tcPr>
           <w:tbl>
             <w:tblPr>
-              <w:tblW w:type="dxa" w:w="2200"/>
+              <w:tblW w:type="dxa" w:w="1696"/>
               <w:tblBorders>
                 <w:top w:val="single" w:color="auto" w:sz="4"/>
                 <w:left w:val="single" w:color="auto" w:sz="4"/>
@@ -17058,7 +17054,7 @@
               </w:tblBorders>
             </w:tblPr>
             <w:tblGrid>
-              <w:gridCol w:w="1650"/>
+              <w:gridCol w:w="1146"/>
               <w:gridCol w:w="870"/>
             </w:tblGrid>
             <w:tr>
@@ -17067,7 +17063,7 @@
               </w:trPr>
               <w:tc>
                 <w:tcPr>
-                  <w:tcW w:type="dxa" w:w="1650"/>
+                  <w:tcW w:type="dxa" w:w="1146"/>
                   <w:tcBorders>
                     <w:top w:val="none" w:color="FFFFFF" w:sz="0"/>
                     <w:left w:val="none" w:color="FFFFFF" w:sz="0"/>
@@ -17090,7 +17086,7 @@
                   <w:r>
                     <w:drawing>
                       <wp:inline distT="0" distB="0" distL="0" distR="0">
-                        <wp:extent cx="819150" cy="142875"/>
+                        <wp:extent cx="495300" cy="85725"/>
                         <wp:effectExtent t="0" r="0" b="0" l="0"/>
                         <wp:docPr id="1" name="img" descr="image" title="readyforthenextlevel.png"/>
                         <wp:cNvGraphicFramePr>
@@ -17115,7 +17111,7 @@
                               <pic:spPr bwMode="auto">
                                 <a:xfrm>
                                   <a:off x="0" y="0"/>
-                                  <a:ext cx="819150" cy="142875"/>
+                                  <a:ext cx="495300" cy="85725"/>
                                 </a:xfrm>
                                 <a:prstGeom prst="rect">
                                   <a:avLst/>
@@ -17214,9 +17210,14 @@
           </w:tbl>
           <w:p/>
         </w:tc>
-        <w:tc>
-          <w:tcPr>
-            <w:tcW w:type="dxa" w:w="2520"/>
+      </w:tr>
+      <w:tr>
+        <w:trPr>
+          <w:cantSplit/>
+        </w:trPr>
+        <w:tc>
+          <w:tcPr>
+            <w:tcW w:type="dxa" w:w="2016"/>
             <w:tcBorders>
               <w:top w:val="single" w:color="C9D2DE" w:sz="4"/>
               <w:left w:val="single" w:color="C9D2DE" w:sz="4"/>
@@ -17234,7 +17235,7 @@
           </w:tcPr>
           <w:tbl>
             <w:tblPr>
-              <w:tblW w:type="dxa" w:w="2200"/>
+              <w:tblW w:type="dxa" w:w="1696"/>
               <w:tblBorders>
                 <w:top w:val="single" w:color="auto" w:sz="4"/>
                 <w:left w:val="single" w:color="auto" w:sz="4"/>
@@ -17245,7 +17246,7 @@
               </w:tblBorders>
             </w:tblPr>
             <w:tblGrid>
-              <w:gridCol w:w="1650"/>
+              <w:gridCol w:w="1146"/>
               <w:gridCol w:w="870"/>
             </w:tblGrid>
             <w:tr>
@@ -17254,7 +17255,7 @@
               </w:trPr>
               <w:tc>
                 <w:tcPr>
-                  <w:tcW w:type="dxa" w:w="1650"/>
+                  <w:tcW w:type="dxa" w:w="1146"/>
                   <w:tcBorders>
                     <w:top w:val="none" w:color="FFFFFF" w:sz="0"/>
                     <w:left w:val="none" w:color="FFFFFF" w:sz="0"/>
@@ -17277,7 +17278,7 @@
                   <w:r>
                     <w:drawing>
                       <wp:inline distT="0" distB="0" distL="0" distR="0">
-                        <wp:extent cx="819150" cy="161925"/>
+                        <wp:extent cx="495300" cy="95250"/>
                         <wp:effectExtent t="0" r="0" b="0" l="0"/>
                         <wp:docPr id="1" name="img" descr="image" title="profitworks.png"/>
                         <wp:cNvGraphicFramePr>
@@ -17302,7 +17303,7 @@
                               <pic:spPr bwMode="auto">
                                 <a:xfrm>
                                   <a:off x="0" y="0"/>
-                                  <a:ext cx="819150" cy="161925"/>
+                                  <a:ext cx="495300" cy="95250"/>
                                 </a:xfrm>
                                 <a:prstGeom prst="rect">
                                   <a:avLst/>
@@ -17403,7 +17404,7 @@
         </w:tc>
         <w:tc>
           <w:tcPr>
-            <w:tcW w:type="dxa" w:w="2520"/>
+            <w:tcW w:type="dxa" w:w="2016"/>
             <w:tcBorders>
               <w:top w:val="single" w:color="C9D2DE" w:sz="4"/>
               <w:left w:val="single" w:color="C9D2DE" w:sz="4"/>
@@ -17421,7 +17422,7 @@
           </w:tcPr>
           <w:tbl>
             <w:tblPr>
-              <w:tblW w:type="dxa" w:w="2200"/>
+              <w:tblW w:type="dxa" w:w="1696"/>
               <w:tblBorders>
                 <w:top w:val="single" w:color="auto" w:sz="4"/>
                 <w:left w:val="single" w:color="auto" w:sz="4"/>
@@ -17432,7 +17433,7 @@
               </w:tblBorders>
             </w:tblPr>
             <w:tblGrid>
-              <w:gridCol w:w="1650"/>
+              <w:gridCol w:w="1146"/>
               <w:gridCol w:w="870"/>
             </w:tblGrid>
             <w:tr>
@@ -17441,7 +17442,7 @@
               </w:trPr>
               <w:tc>
                 <w:tcPr>
-                  <w:tcW w:type="dxa" w:w="1650"/>
+                  <w:tcW w:type="dxa" w:w="1146"/>
                   <w:tcBorders>
                     <w:top w:val="none" w:color="FFFFFF" w:sz="0"/>
                     <w:left w:val="none" w:color="FFFFFF" w:sz="0"/>
@@ -17464,7 +17465,7 @@
                   <w:r>
                     <w:drawing>
                       <wp:inline distT="0" distB="0" distL="0" distR="0">
-                        <wp:extent cx="819150" cy="85725"/>
+                        <wp:extent cx="495300" cy="47625"/>
                         <wp:effectExtent t="0" r="0" b="0" l="0"/>
                         <wp:docPr id="1" name="img" descr="image" title="talentharbor.png"/>
                         <wp:cNvGraphicFramePr>
@@ -17489,7 +17490,7 @@
                               <pic:spPr bwMode="auto">
                                 <a:xfrm>
                                   <a:off x="0" y="0"/>
-                                  <a:ext cx="819150" cy="85725"/>
+                                  <a:ext cx="495300" cy="47625"/>
                                 </a:xfrm>
                                 <a:prstGeom prst="rect">
                                   <a:avLst/>
@@ -17590,7 +17591,7 @@
         </w:tc>
         <w:tc>
           <w:tcPr>
-            <w:tcW w:type="dxa" w:w="2520"/>
+            <w:tcW w:type="dxa" w:w="2016"/>
             <w:tcBorders>
               <w:top w:val="single" w:color="C9D2DE" w:sz="4"/>
               <w:left w:val="single" w:color="C9D2DE" w:sz="4"/>
@@ -17608,7 +17609,7 @@
           </w:tcPr>
           <w:tbl>
             <w:tblPr>
-              <w:tblW w:type="dxa" w:w="2200"/>
+              <w:tblW w:type="dxa" w:w="1696"/>
               <w:tblBorders>
                 <w:top w:val="single" w:color="auto" w:sz="4"/>
                 <w:left w:val="single" w:color="auto" w:sz="4"/>
@@ -17619,7 +17620,7 @@
               </w:tblBorders>
             </w:tblPr>
             <w:tblGrid>
-              <w:gridCol w:w="1650"/>
+              <w:gridCol w:w="1146"/>
               <w:gridCol w:w="870"/>
             </w:tblGrid>
             <w:tr>
@@ -17628,7 +17629,7 @@
               </w:trPr>
               <w:tc>
                 <w:tcPr>
-                  <w:tcW w:type="dxa" w:w="1650"/>
+                  <w:tcW w:type="dxa" w:w="1146"/>
                   <w:tcBorders>
                     <w:top w:val="none" w:color="FFFFFF" w:sz="0"/>
                     <w:left w:val="none" w:color="FFFFFF" w:sz="0"/>
@@ -17651,7 +17652,7 @@
                   <w:r>
                     <w:drawing>
                       <wp:inline distT="0" distB="0" distL="0" distR="0">
-                        <wp:extent cx="819150" cy="228600"/>
+                        <wp:extent cx="495300" cy="133350"/>
                         <wp:effectExtent t="0" r="0" b="0" l="0"/>
                         <wp:docPr id="1" name="img" descr="image" title="wolfsedgeintegrators.png"/>
                         <wp:cNvGraphicFramePr>
@@ -17676,7 +17677,7 @@
                               <pic:spPr bwMode="auto">
                                 <a:xfrm>
                                   <a:off x="0" y="0"/>
-                                  <a:ext cx="819150" cy="228600"/>
+                                  <a:ext cx="495300" cy="133350"/>
                                 </a:xfrm>
                                 <a:prstGeom prst="rect">
                                   <a:avLst/>
@@ -17774,6 +17775,216 @@
             </w:tr>
           </w:tbl>
           <w:p/>
+        </w:tc>
+        <w:tc>
+          <w:tcPr>
+            <w:tcW w:type="dxa" w:w="2016"/>
+            <w:tcBorders>
+              <w:top w:val="single" w:color="C9D2DE" w:sz="4"/>
+              <w:left w:val="single" w:color="C9D2DE" w:sz="4"/>
+              <w:bottom w:val="single" w:color="C9D2DE" w:sz="4"/>
+              <w:right w:val="single" w:color="C9D2DE" w:sz="4"/>
+            </w:tcBorders>
+            <w:shd w:fill="FFFFFF" w:val="clear"/>
+            <w:tcMar>
+              <w:top w:type="dxa" w:w="40"/>
+              <w:left w:type="dxa" w:w="140"/>
+              <w:bottom w:type="dxa" w:w="40"/>
+              <w:right w:type="dxa" w:w="140"/>
+            </w:tcMar>
+            <w:vAlign w:val="center"/>
+          </w:tcPr>
+          <w:tbl>
+            <w:tblPr>
+              <w:tblW w:type="dxa" w:w="1696"/>
+              <w:tblBorders>
+                <w:top w:val="single" w:color="auto" w:sz="4"/>
+                <w:left w:val="single" w:color="auto" w:sz="4"/>
+                <w:bottom w:val="single" w:color="auto" w:sz="4"/>
+                <w:right w:val="single" w:color="auto" w:sz="4"/>
+                <w:insideH w:val="single" w:color="auto" w:sz="4"/>
+                <w:insideV w:val="single" w:color="auto" w:sz="4"/>
+              </w:tblBorders>
+            </w:tblPr>
+            <w:tblGrid>
+              <w:gridCol w:w="1146"/>
+              <w:gridCol w:w="870"/>
+            </w:tblGrid>
+            <w:tr>
+              <w:trPr>
+                <w:cantSplit/>
+              </w:trPr>
+              <w:tc>
+                <w:tcPr>
+                  <w:tcW w:type="dxa" w:w="1146"/>
+                  <w:tcBorders>
+                    <w:top w:val="none" w:color="FFFFFF" w:sz="0"/>
+                    <w:left w:val="none" w:color="FFFFFF" w:sz="0"/>
+                    <w:bottom w:val="none" w:color="FFFFFF" w:sz="0"/>
+                    <w:right w:val="none" w:color="FFFFFF" w:sz="0"/>
+                  </w:tcBorders>
+                  <w:tcMar>
+                    <w:top w:type="dxa" w:w="0"/>
+                    <w:left w:type="dxa" w:w="0"/>
+                    <w:bottom w:type="dxa" w:w="0"/>
+                    <w:right w:type="dxa" w:w="120"/>
+                  </w:tcMar>
+                  <w:vAlign w:val="center"/>
+                </w:tcPr>
+                <w:p>
+                  <w:pPr>
+                    <w:spacing w:after="40"/>
+                    <w:jc w:val="left"/>
+                  </w:pPr>
+                  <w:r>
+                    <w:drawing>
+                      <wp:inline distT="0" distB="0" distL="0" distR="0">
+                        <wp:extent cx="495300" cy="114300"/>
+                        <wp:effectExtent t="0" r="0" b="0" l="0"/>
+                        <wp:docPr id="1" name="img" descr="image" title="vcfo.png"/>
+                        <wp:cNvGraphicFramePr>
+                          <a:graphicFrameLocks xmlns:a="http://schemas.openxmlformats.org/drawingml/2006/main" noChangeAspect="1"/>
+                        </wp:cNvGraphicFramePr>
+                        <a:graphic xmlns:a="http://schemas.openxmlformats.org/drawingml/2006/main">
+                          <a:graphicData uri="http://schemas.openxmlformats.org/drawingml/2006/picture">
+                            <pic:pic xmlns:pic="http://schemas.openxmlformats.org/drawingml/2006/picture">
+                              <pic:nvPicPr>
+                                <pic:cNvPr id="0" name="" descr=""/>
+                                <pic:cNvPicPr>
+                                  <a:picLocks noChangeAspect="1" noChangeArrowheads="1"/>
+                                </pic:cNvPicPr>
+                              </pic:nvPicPr>
+                              <pic:blipFill>
+                                <a:blip r:embed="rId56" cstate="none"/>
+                                <a:srcRect/>
+                                <a:stretch>
+                                  <a:fillRect/>
+                                </a:stretch>
+                              </pic:blipFill>
+                              <pic:spPr bwMode="auto">
+                                <a:xfrm>
+                                  <a:off x="0" y="0"/>
+                                  <a:ext cx="495300" cy="114300"/>
+                                </a:xfrm>
+                                <a:prstGeom prst="rect">
+                                  <a:avLst/>
+                                </a:prstGeom>
+                              </pic:spPr>
+                            </pic:pic>
+                          </a:graphicData>
+                        </a:graphic>
+                      </wp:inline>
+                    </w:drawing>
+                  </w:r>
+                </w:p>
+                <w:p>
+                  <w:pPr>
+                    <w:spacing w:after="0"/>
+                    <w:jc w:val="left"/>
+                  </w:pPr>
+                  <w:r>
+                    <w:rPr>
+                      <w:rFonts w:ascii="Calibri" w:cs="Calibri" w:eastAsia="Calibri" w:hAnsi="Calibri"/>
+                      <w:b/>
+                      <w:bCs/>
+                      <w:color w:val="0B1F3A"/>
+                      <w:sz w:val="14"/>
+                      <w:szCs w:val="14"/>
+                    </w:rPr>
+                    <w:t xml:space="preserve">vcfo</w:t>
+                  </w:r>
+                </w:p>
+              </w:tc>
+              <w:tc>
+                <w:tcPr>
+                  <w:tcW w:type="dxa" w:w="870"/>
+                  <w:tcBorders>
+                    <w:top w:val="none" w:color="FFFFFF" w:sz="0"/>
+                    <w:left w:val="none" w:color="FFFFFF" w:sz="0"/>
+                    <w:bottom w:val="none" w:color="FFFFFF" w:sz="0"/>
+                    <w:right w:val="none" w:color="FFFFFF" w:sz="0"/>
+                  </w:tcBorders>
+                  <w:tcMar>
+                    <w:top w:type="dxa" w:w="0"/>
+                    <w:left w:type="dxa" w:w="120"/>
+                    <w:bottom w:type="dxa" w:w="0"/>
+                    <w:right w:type="dxa" w:w="0"/>
+                  </w:tcMar>
+                  <w:vAlign w:val="center"/>
+                </w:tcPr>
+                <w:p>
+                  <w:pPr>
+                    <w:spacing w:after="0"/>
+                    <w:jc w:val="right"/>
+                  </w:pPr>
+                  <w:r>
+                    <w:drawing>
+                      <wp:inline distT="0" distB="0" distL="0" distR="0">
+                        <wp:extent cx="400050" cy="400050"/>
+                        <wp:effectExtent t="0" r="0" b="0" l="0"/>
+                        <wp:docPr id="1" name="img" descr="image" title="sponsor-vcfo.png"/>
+                        <wp:cNvGraphicFramePr>
+                          <a:graphicFrameLocks xmlns:a="http://schemas.openxmlformats.org/drawingml/2006/main" noChangeAspect="1"/>
+                        </wp:cNvGraphicFramePr>
+                        <a:graphic xmlns:a="http://schemas.openxmlformats.org/drawingml/2006/main">
+                          <a:graphicData uri="http://schemas.openxmlformats.org/drawingml/2006/picture">
+                            <pic:pic xmlns:pic="http://schemas.openxmlformats.org/drawingml/2006/picture">
+                              <pic:nvPicPr>
+                                <pic:cNvPr id="0" name="" descr=""/>
+                                <pic:cNvPicPr>
+                                  <a:picLocks noChangeAspect="1" noChangeArrowheads="1"/>
+                                </pic:cNvPicPr>
+                              </pic:nvPicPr>
+                              <pic:blipFill>
+                                <a:blip r:embed="rId57" cstate="none"/>
+                                <a:srcRect/>
+                                <a:stretch>
+                                  <a:fillRect/>
+                                </a:stretch>
+                              </pic:blipFill>
+                              <pic:spPr bwMode="auto">
+                                <a:xfrm>
+                                  <a:off x="0" y="0"/>
+                                  <a:ext cx="400050" cy="400050"/>
+                                </a:xfrm>
+                                <a:prstGeom prst="rect">
+                                  <a:avLst/>
+                                </a:prstGeom>
+                              </pic:spPr>
+                            </pic:pic>
+                          </a:graphicData>
+                        </a:graphic>
+                      </wp:inline>
+                    </w:drawing>
+                  </w:r>
+                </w:p>
+              </w:tc>
+            </w:tr>
+          </w:tbl>
+          <w:p/>
+        </w:tc>
+        <w:tc>
+          <w:tcPr>
+            <w:tcW w:type="dxa" w:w="2016"/>
+            <w:tcBorders>
+              <w:top w:val="none" w:color="FFFFFF" w:sz="0"/>
+              <w:left w:val="none" w:color="FFFFFF" w:sz="0"/>
+              <w:bottom w:val="none" w:color="FFFFFF" w:sz="0"/>
+              <w:right w:val="none" w:color="FFFFFF" w:sz="0"/>
+            </w:tcBorders>
+            <w:tcMar>
+              <w:top w:type="dxa" w:w="80"/>
+              <w:left w:type="dxa" w:w="120"/>
+              <w:bottom w:type="dxa" w:w="80"/>
+              <w:right w:type="dxa" w:w="120"/>
+            </w:tcMar>
+            <w:vAlign w:val="center"/>
+          </w:tcPr>
+          <w:p>
+            <w:r>
+              <w:t xml:space="preserve"/>
+            </w:r>
+          </w:p>
         </w:tc>
       </w:tr>
     </w:tbl>
@@ -17934,7 +18145,7 @@
                                 </pic:cNvPicPr>
                               </pic:nvPicPr>
                               <pic:blipFill>
-                                <a:blip r:embed="rId56" cstate="none"/>
+                                <a:blip r:embed="rId58" cstate="none"/>
                                 <a:srcRect/>
                                 <a:stretch>
                                   <a:fillRect/>
@@ -18073,7 +18284,7 @@
                                 </pic:cNvPicPr>
                               </pic:nvPicPr>
                               <pic:blipFill>
-                                <a:blip r:embed="rId57" cstate="none"/>
+                                <a:blip r:embed="rId59" cstate="none"/>
                                 <a:srcRect/>
                                 <a:stretch>
                                   <a:fillRect/>
@@ -18180,7 +18391,7 @@
                                 </pic:cNvPicPr>
                               </pic:nvPicPr>
                               <pic:blipFill>
-                                <a:blip r:embed="rId58" cstate="none"/>
+                                <a:blip r:embed="rId60" cstate="none"/>
                                 <a:srcRect/>
                                 <a:stretch>
                                   <a:fillRect/>
@@ -18319,7 +18530,7 @@
                                 </pic:cNvPicPr>
                               </pic:nvPicPr>
                               <pic:blipFill>
-                                <a:blip r:embed="rId59" cstate="none"/>
+                                <a:blip r:embed="rId61" cstate="none"/>
                                 <a:srcRect/>
                                 <a:stretch>
                                   <a:fillRect/>
@@ -18456,7 +18667,7 @@
                                 </pic:cNvPicPr>
                               </pic:nvPicPr>
                               <pic:blipFill>
-                                <a:blip r:embed="rId60" cstate="none"/>
+                                <a:blip r:embed="rId62" cstate="none"/>
                                 <a:srcRect/>
                                 <a:stretch>
                                   <a:fillRect/>
@@ -18595,7 +18806,7 @@
                                 </pic:cNvPicPr>
                               </pic:nvPicPr>
                               <pic:blipFill>
-                                <a:blip r:embed="rId61" cstate="none"/>
+                                <a:blip r:embed="rId63" cstate="none"/>
                                 <a:srcRect/>
                                 <a:stretch>
                                   <a:fillRect/>
@@ -18702,7 +18913,7 @@
                                 </pic:cNvPicPr>
                               </pic:nvPicPr>
                               <pic:blipFill>
-                                <a:blip r:embed="rId62" cstate="none"/>
+                                <a:blip r:embed="rId64" cstate="none"/>
                                 <a:srcRect/>
                                 <a:stretch>
                                   <a:fillRect/>
@@ -18841,7 +19052,7 @@
                                 </pic:cNvPicPr>
                               </pic:nvPicPr>
                               <pic:blipFill>
-                                <a:blip r:embed="rId63" cstate="none"/>
+                                <a:blip r:embed="rId65" cstate="none"/>
                                 <a:srcRect/>
                                 <a:stretch>
                                   <a:fillRect/>
@@ -18978,7 +19189,7 @@
                                 </pic:cNvPicPr>
                               </pic:nvPicPr>
                               <pic:blipFill>
-                                <a:blip r:embed="rId64" cstate="none"/>
+                                <a:blip r:embed="rId66" cstate="none"/>
                                 <a:srcRect/>
                                 <a:stretch>
                                   <a:fillRect/>
@@ -19117,7 +19328,7 @@
                                 </pic:cNvPicPr>
                               </pic:nvPicPr>
                               <pic:blipFill>
-                                <a:blip r:embed="rId65" cstate="none"/>
+                                <a:blip r:embed="rId67" cstate="none"/>
                                 <a:srcRect/>
                                 <a:stretch>
                                   <a:fillRect/>
@@ -19224,7 +19435,7 @@
                                 </pic:cNvPicPr>
                               </pic:nvPicPr>
                               <pic:blipFill>
-                                <a:blip r:embed="rId66" cstate="none"/>
+                                <a:blip r:embed="rId68" cstate="none"/>
                                 <a:srcRect/>
                                 <a:stretch>
                                   <a:fillRect/>
@@ -19363,7 +19574,7 @@
                                 </pic:cNvPicPr>
                               </pic:nvPicPr>
                               <pic:blipFill>
-                                <a:blip r:embed="rId67" cstate="none"/>
+                                <a:blip r:embed="rId69" cstate="none"/>
                                 <a:srcRect/>
                                 <a:stretch>
                                   <a:fillRect/>
@@ -19500,7 +19711,7 @@
                                 </pic:cNvPicPr>
                               </pic:nvPicPr>
                               <pic:blipFill>
-                                <a:blip r:embed="rId68" cstate="none"/>
+                                <a:blip r:embed="rId70" cstate="none"/>
                                 <a:srcRect/>
                                 <a:stretch>
                                   <a:fillRect/>
@@ -19639,7 +19850,7 @@
                                 </pic:cNvPicPr>
                               </pic:nvPicPr>
                               <pic:blipFill>
-                                <a:blip r:embed="rId69" cstate="none"/>
+                                <a:blip r:embed="rId71" cstate="none"/>
                                 <a:srcRect/>
                                 <a:stretch>
                                   <a:fillRect/>
@@ -19746,7 +19957,7 @@
                                 </pic:cNvPicPr>
                               </pic:nvPicPr>
                               <pic:blipFill>
-                                <a:blip r:embed="rId70" cstate="none"/>
+                                <a:blip r:embed="rId72" cstate="none"/>
                                 <a:srcRect/>
                                 <a:stretch>
                                   <a:fillRect/>
@@ -19885,7 +20096,7 @@
                                 </pic:cNvPicPr>
                               </pic:nvPicPr>
                               <pic:blipFill>
-                                <a:blip r:embed="rId71" cstate="none"/>
+                                <a:blip r:embed="rId73" cstate="none"/>
                                 <a:srcRect/>
                                 <a:stretch>
                                   <a:fillRect/>
@@ -20022,7 +20233,7 @@
                                 </pic:cNvPicPr>
                               </pic:nvPicPr>
                               <pic:blipFill>
-                                <a:blip r:embed="rId72" cstate="none"/>
+                                <a:blip r:embed="rId74" cstate="none"/>
                                 <a:srcRect/>
                                 <a:stretch>
                                   <a:fillRect/>
@@ -20161,7 +20372,7 @@
                                 </pic:cNvPicPr>
                               </pic:nvPicPr>
                               <pic:blipFill>
-                                <a:blip r:embed="rId73" cstate="none"/>
+                                <a:blip r:embed="rId75" cstate="none"/>
                                 <a:srcRect/>
                                 <a:stretch>
                                   <a:fillRect/>
@@ -20268,7 +20479,7 @@
                                 </pic:cNvPicPr>
                               </pic:nvPicPr>
                               <pic:blipFill>
-                                <a:blip r:embed="rId74" cstate="none"/>
+                                <a:blip r:embed="rId76" cstate="none"/>
                                 <a:srcRect/>
                                 <a:stretch>
                                   <a:fillRect/>
@@ -20407,7 +20618,7 @@
                                 </pic:cNvPicPr>
                               </pic:nvPicPr>
                               <pic:blipFill>
-                                <a:blip r:embed="rId75" cstate="none"/>
+                                <a:blip r:embed="rId77" cstate="none"/>
                                 <a:srcRect/>
                                 <a:stretch>
                                   <a:fillRect/>
@@ -20544,7 +20755,7 @@
                                 </pic:cNvPicPr>
                               </pic:nvPicPr>
                               <pic:blipFill>
-                                <a:blip r:embed="rId76" cstate="none"/>
+                                <a:blip r:embed="rId78" cstate="none"/>
                                 <a:srcRect/>
                                 <a:stretch>
                                   <a:fillRect/>
@@ -20683,7 +20894,7 @@
                                 </pic:cNvPicPr>
                               </pic:nvPicPr>
                               <pic:blipFill>
-                                <a:blip r:embed="rId77" cstate="none"/>
+                                <a:blip r:embed="rId79" cstate="none"/>
                                 <a:srcRect/>
                                 <a:stretch>
                                   <a:fillRect/>
@@ -20790,7 +21001,7 @@
                                 </pic:cNvPicPr>
                               </pic:nvPicPr>
                               <pic:blipFill>
-                                <a:blip r:embed="rId78" cstate="none"/>
+                                <a:blip r:embed="rId80" cstate="none"/>
                                 <a:srcRect/>
                                 <a:stretch>
                                   <a:fillRect/>
@@ -20929,7 +21140,7 @@
                                 </pic:cNvPicPr>
                               </pic:nvPicPr>
                               <pic:blipFill>
-                                <a:blip r:embed="rId79" cstate="none"/>
+                                <a:blip r:embed="rId81" cstate="none"/>
                                 <a:srcRect/>
                                 <a:stretch>
                                   <a:fillRect/>
@@ -21066,7 +21277,7 @@
                                 </pic:cNvPicPr>
                               </pic:nvPicPr>
                               <pic:blipFill>
-                                <a:blip r:embed="rId80" cstate="none"/>
+                                <a:blip r:embed="rId82" cstate="none"/>
                                 <a:srcRect/>
                                 <a:stretch>
                                   <a:fillRect/>
@@ -21205,7 +21416,7 @@
                                 </pic:cNvPicPr>
                               </pic:nvPicPr>
                               <pic:blipFill>
-                                <a:blip r:embed="rId81" cstate="none"/>
+                                <a:blip r:embed="rId83" cstate="none"/>
                                 <a:srcRect/>
                                 <a:stretch>
                                   <a:fillRect/>
@@ -21312,7 +21523,7 @@
                                 </pic:cNvPicPr>
                               </pic:nvPicPr>
                               <pic:blipFill>
-                                <a:blip r:embed="rId82" cstate="none"/>
+                                <a:blip r:embed="rId84" cstate="none"/>
                                 <a:srcRect/>
                                 <a:stretch>
                                   <a:fillRect/>
@@ -21451,7 +21662,7 @@
                                 </pic:cNvPicPr>
                               </pic:nvPicPr>
                               <pic:blipFill>
-                                <a:blip r:embed="rId83" cstate="none"/>
+                                <a:blip r:embed="rId85" cstate="none"/>
                                 <a:srcRect/>
                                 <a:stretch>
                                   <a:fillRect/>
@@ -21588,7 +21799,7 @@
                                 </pic:cNvPicPr>
                               </pic:nvPicPr>
                               <pic:blipFill>
-                                <a:blip r:embed="rId84" cstate="none"/>
+                                <a:blip r:embed="rId86" cstate="none"/>
                                 <a:srcRect/>
                                 <a:stretch>
                                   <a:fillRect/>
@@ -21752,7 +21963,7 @@
                                 </pic:cNvPicPr>
                               </pic:nvPicPr>
                               <pic:blipFill>
-                                <a:blip r:embed="rId85" cstate="none"/>
+                                <a:blip r:embed="rId87" cstate="none"/>
                                 <a:srcRect/>
                                 <a:stretch>
                                   <a:fillRect/>
@@ -21859,7 +22070,7 @@
                                 </pic:cNvPicPr>
                               </pic:nvPicPr>
                               <pic:blipFill>
-                                <a:blip r:embed="rId86" cstate="none"/>
+                                <a:blip r:embed="rId88" cstate="none"/>
                                 <a:srcRect/>
                                 <a:stretch>
                                   <a:fillRect/>
@@ -22023,7 +22234,7 @@
                                 </pic:cNvPicPr>
                               </pic:nvPicPr>
                               <pic:blipFill>
-                                <a:blip r:embed="rId87" cstate="none"/>
+                                <a:blip r:embed="rId89" cstate="none"/>
                                 <a:srcRect/>
                                 <a:stretch>
                                   <a:fillRect/>
@@ -22160,7 +22371,7 @@
                                 </pic:cNvPicPr>
                               </pic:nvPicPr>
                               <pic:blipFill>
-                                <a:blip r:embed="rId88" cstate="none"/>
+                                <a:blip r:embed="rId90" cstate="none"/>
                                 <a:srcRect/>
                                 <a:stretch>
                                   <a:fillRect/>
@@ -22299,7 +22510,7 @@
                                 </pic:cNvPicPr>
                               </pic:nvPicPr>
                               <pic:blipFill>
-                                <a:blip r:embed="rId89" cstate="none"/>
+                                <a:blip r:embed="rId91" cstate="none"/>
                                 <a:srcRect/>
                                 <a:stretch>
                                   <a:fillRect/>
@@ -22406,7 +22617,7 @@
                                 </pic:cNvPicPr>
                               </pic:nvPicPr>
                               <pic:blipFill>
-                                <a:blip r:embed="rId90" cstate="none"/>
+                                <a:blip r:embed="rId92" cstate="none"/>
                                 <a:srcRect/>
                                 <a:stretch>
                                   <a:fillRect/>
@@ -22545,7 +22756,7 @@
                                 </pic:cNvPicPr>
                               </pic:nvPicPr>
                               <pic:blipFill>
-                                <a:blip r:embed="rId91" cstate="none"/>
+                                <a:blip r:embed="rId93" cstate="none"/>
                                 <a:srcRect/>
                                 <a:stretch>
                                   <a:fillRect/>
@@ -22682,7 +22893,7 @@
                                 </pic:cNvPicPr>
                               </pic:nvPicPr>
                               <pic:blipFill>
-                                <a:blip r:embed="rId92" cstate="none"/>
+                                <a:blip r:embed="rId94" cstate="none"/>
                                 <a:srcRect/>
                                 <a:stretch>
                                   <a:fillRect/>
@@ -22821,7 +23032,7 @@
                                 </pic:cNvPicPr>
                               </pic:nvPicPr>
                               <pic:blipFill>
-                                <a:blip r:embed="rId93" cstate="none"/>
+                                <a:blip r:embed="rId95" cstate="none"/>
                                 <a:srcRect/>
                                 <a:stretch>
                                   <a:fillRect/>
@@ -22928,7 +23139,7 @@
                                 </pic:cNvPicPr>
                               </pic:nvPicPr>
                               <pic:blipFill>
-                                <a:blip r:embed="rId94" cstate="none"/>
+                                <a:blip r:embed="rId96" cstate="none"/>
                                 <a:srcRect/>
                                 <a:stretch>
                                   <a:fillRect/>
@@ -23067,7 +23278,7 @@
                                 </pic:cNvPicPr>
                               </pic:nvPicPr>
                               <pic:blipFill>
-                                <a:blip r:embed="rId95" cstate="none"/>
+                                <a:blip r:embed="rId97" cstate="none"/>
                                 <a:srcRect/>
                                 <a:stretch>
                                   <a:fillRect/>
@@ -23204,7 +23415,7 @@
                                 </pic:cNvPicPr>
                               </pic:nvPicPr>
                               <pic:blipFill>
-                                <a:blip r:embed="rId96" cstate="none"/>
+                                <a:blip r:embed="rId98" cstate="none"/>
                                 <a:srcRect/>
                                 <a:stretch>
                                   <a:fillRect/>
@@ -23343,7 +23554,7 @@
                                 </pic:cNvPicPr>
                               </pic:nvPicPr>
                               <pic:blipFill>
-                                <a:blip r:embed="rId97" cstate="none"/>
+                                <a:blip r:embed="rId99" cstate="none"/>
                                 <a:srcRect/>
                                 <a:stretch>
                                   <a:fillRect/>
@@ -23450,7 +23661,7 @@
                                 </pic:cNvPicPr>
                               </pic:nvPicPr>
                               <pic:blipFill>
-                                <a:blip r:embed="rId98" cstate="none"/>
+                                <a:blip r:embed="rId100" cstate="none"/>
                                 <a:srcRect/>
                                 <a:stretch>
                                   <a:fillRect/>
@@ -23589,7 +23800,7 @@
                                 </pic:cNvPicPr>
                               </pic:nvPicPr>
                               <pic:blipFill>
-                                <a:blip r:embed="rId99" cstate="none"/>
+                                <a:blip r:embed="rId101" cstate="none"/>
                                 <a:srcRect/>
                                 <a:stretch>
                                   <a:fillRect/>
@@ -23726,7 +23937,7 @@
                                 </pic:cNvPicPr>
                               </pic:nvPicPr>
                               <pic:blipFill>
-                                <a:blip r:embed="rId100" cstate="none"/>
+                                <a:blip r:embed="rId102" cstate="none"/>
                                 <a:srcRect/>
                                 <a:stretch>
                                   <a:fillRect/>
@@ -23865,7 +24076,7 @@
                                 </pic:cNvPicPr>
                               </pic:nvPicPr>
                               <pic:blipFill>
-                                <a:blip r:embed="rId101" cstate="none"/>
+                                <a:blip r:embed="rId103" cstate="none"/>
                                 <a:srcRect/>
                                 <a:stretch>
                                   <a:fillRect/>
@@ -23972,7 +24183,7 @@
                                 </pic:cNvPicPr>
                               </pic:nvPicPr>
                               <pic:blipFill>
-                                <a:blip r:embed="rId102" cstate="none"/>
+                                <a:blip r:embed="rId104" cstate="none"/>
                                 <a:srcRect/>
                                 <a:stretch>
                                   <a:fillRect/>
@@ -24136,7 +24347,7 @@
                                 </pic:cNvPicPr>
                               </pic:nvPicPr>
                               <pic:blipFill>
-                                <a:blip r:embed="rId103" cstate="none"/>
+                                <a:blip r:embed="rId105" cstate="none"/>
                                 <a:srcRect/>
                                 <a:stretch>
                                   <a:fillRect/>
@@ -24273,7 +24484,7 @@
                                 </pic:cNvPicPr>
                               </pic:nvPicPr>
                               <pic:blipFill>
-                                <a:blip r:embed="rId104" cstate="none"/>
+                                <a:blip r:embed="rId106" cstate="none"/>
                                 <a:srcRect/>
                                 <a:stretch>
                                   <a:fillRect/>
@@ -24437,7 +24648,7 @@
                                 </pic:cNvPicPr>
                               </pic:nvPicPr>
                               <pic:blipFill>
-                                <a:blip r:embed="rId105" cstate="none"/>
+                                <a:blip r:embed="rId107" cstate="none"/>
                                 <a:srcRect/>
                                 <a:stretch>
                                   <a:fillRect/>
@@ -24544,7 +24755,7 @@
                                 </pic:cNvPicPr>
                               </pic:nvPicPr>
                               <pic:blipFill>
-                                <a:blip r:embed="rId106" cstate="none"/>
+                                <a:blip r:embed="rId108" cstate="none"/>
                                 <a:srcRect/>
                                 <a:stretch>
                                   <a:fillRect/>
@@ -24683,7 +24894,7 @@
                                 </pic:cNvPicPr>
                               </pic:nvPicPr>
                               <pic:blipFill>
-                                <a:blip r:embed="rId107" cstate="none"/>
+                                <a:blip r:embed="rId109" cstate="none"/>
                                 <a:srcRect/>
                                 <a:stretch>
                                   <a:fillRect/>
@@ -24820,7 +25031,7 @@
                                 </pic:cNvPicPr>
                               </pic:nvPicPr>
                               <pic:blipFill>
-                                <a:blip r:embed="rId108" cstate="none"/>
+                                <a:blip r:embed="rId110" cstate="none"/>
                                 <a:srcRect/>
                                 <a:stretch>
                                   <a:fillRect/>
@@ -24959,7 +25170,7 @@
                                 </pic:cNvPicPr>
                               </pic:nvPicPr>
                               <pic:blipFill>
-                                <a:blip r:embed="rId109" cstate="none"/>
+                                <a:blip r:embed="rId111" cstate="none"/>
                                 <a:srcRect/>
                                 <a:stretch>
                                   <a:fillRect/>
@@ -25066,7 +25277,7 @@
                                 </pic:cNvPicPr>
                               </pic:nvPicPr>
                               <pic:blipFill>
-                                <a:blip r:embed="rId110" cstate="none"/>
+                                <a:blip r:embed="rId112" cstate="none"/>
                                 <a:srcRect/>
                                 <a:stretch>
                                   <a:fillRect/>
@@ -25205,7 +25416,7 @@
                                 </pic:cNvPicPr>
                               </pic:nvPicPr>
                               <pic:blipFill>
-                                <a:blip r:embed="rId111" cstate="none"/>
+                                <a:blip r:embed="rId113" cstate="none"/>
                                 <a:srcRect/>
                                 <a:stretch>
                                   <a:fillRect/>
@@ -25342,7 +25553,7 @@
                                 </pic:cNvPicPr>
                               </pic:nvPicPr>
                               <pic:blipFill>
-                                <a:blip r:embed="rId112" cstate="none"/>
+                                <a:blip r:embed="rId114" cstate="none"/>
                                 <a:srcRect/>
                                 <a:stretch>
                                   <a:fillRect/>
@@ -25481,7 +25692,7 @@
                                 </pic:cNvPicPr>
                               </pic:nvPicPr>
                               <pic:blipFill>
-                                <a:blip r:embed="rId113" cstate="none"/>
+                                <a:blip r:embed="rId115" cstate="none"/>
                                 <a:srcRect/>
                                 <a:stretch>
                                   <a:fillRect/>
@@ -25588,7 +25799,7 @@
                                 </pic:cNvPicPr>
                               </pic:nvPicPr>
                               <pic:blipFill>
-                                <a:blip r:embed="rId114" cstate="none"/>
+                                <a:blip r:embed="rId116" cstate="none"/>
                                 <a:srcRect/>
                                 <a:stretch>
                                   <a:fillRect/>
@@ -25727,7 +25938,7 @@
                                 </pic:cNvPicPr>
                               </pic:nvPicPr>
                               <pic:blipFill>
-                                <a:blip r:embed="rId115" cstate="none"/>
+                                <a:blip r:embed="rId117" cstate="none"/>
                                 <a:srcRect/>
                                 <a:stretch>
                                   <a:fillRect/>
@@ -25864,7 +26075,7 @@
                                 </pic:cNvPicPr>
                               </pic:nvPicPr>
                               <pic:blipFill>
-                                <a:blip r:embed="rId116" cstate="none"/>
+                                <a:blip r:embed="rId118" cstate="none"/>
                                 <a:srcRect/>
                                 <a:stretch>
                                   <a:fillRect/>
@@ -26003,7 +26214,7 @@
                                 </pic:cNvPicPr>
                               </pic:nvPicPr>
                               <pic:blipFill>
-                                <a:blip r:embed="rId117" cstate="none"/>
+                                <a:blip r:embed="rId119" cstate="none"/>
                                 <a:srcRect/>
                                 <a:stretch>
                                   <a:fillRect/>
@@ -26110,7 +26321,7 @@
                                 </pic:cNvPicPr>
                               </pic:nvPicPr>
                               <pic:blipFill>
-                                <a:blip r:embed="rId118" cstate="none"/>
+                                <a:blip r:embed="rId120" cstate="none"/>
                                 <a:srcRect/>
                                 <a:stretch>
                                   <a:fillRect/>
@@ -26249,7 +26460,7 @@
                                 </pic:cNvPicPr>
                               </pic:nvPicPr>
                               <pic:blipFill>
-                                <a:blip r:embed="rId119" cstate="none"/>
+                                <a:blip r:embed="rId121" cstate="none"/>
                                 <a:srcRect/>
                                 <a:stretch>
                                   <a:fillRect/>
@@ -26386,7 +26597,7 @@
                                 </pic:cNvPicPr>
                               </pic:nvPicPr>
                               <pic:blipFill>
-                                <a:blip r:embed="rId120" cstate="none"/>
+                                <a:blip r:embed="rId122" cstate="none"/>
                                 <a:srcRect/>
                                 <a:stretch>
                                   <a:fillRect/>
@@ -26525,7 +26736,7 @@
                                 </pic:cNvPicPr>
                               </pic:nvPicPr>
                               <pic:blipFill>
-                                <a:blip r:embed="rId121" cstate="none"/>
+                                <a:blip r:embed="rId123" cstate="none"/>
                                 <a:srcRect/>
                                 <a:stretch>
                                   <a:fillRect/>
@@ -26632,7 +26843,7 @@
                                 </pic:cNvPicPr>
                               </pic:nvPicPr>
                               <pic:blipFill>
-                                <a:blip r:embed="rId122" cstate="none"/>
+                                <a:blip r:embed="rId124" cstate="none"/>
                                 <a:srcRect/>
                                 <a:stretch>
                                   <a:fillRect/>
@@ -26771,7 +26982,7 @@
                                 </pic:cNvPicPr>
                               </pic:nvPicPr>
                               <pic:blipFill>
-                                <a:blip r:embed="rId123" cstate="none"/>
+                                <a:blip r:embed="rId125" cstate="none"/>
                                 <a:srcRect/>
                                 <a:stretch>
                                   <a:fillRect/>
@@ -26908,7 +27119,7 @@
                                 </pic:cNvPicPr>
                               </pic:nvPicPr>
                               <pic:blipFill>
-                                <a:blip r:embed="rId124" cstate="none"/>
+                                <a:blip r:embed="rId126" cstate="none"/>
                                 <a:srcRect/>
                                 <a:stretch>
                                   <a:fillRect/>
@@ -27047,7 +27258,7 @@
                                 </pic:cNvPicPr>
                               </pic:nvPicPr>
                               <pic:blipFill>
-                                <a:blip r:embed="rId125" cstate="none"/>
+                                <a:blip r:embed="rId127" cstate="none"/>
                                 <a:srcRect/>
                                 <a:stretch>
                                   <a:fillRect/>
@@ -27154,7 +27365,7 @@
                                 </pic:cNvPicPr>
                               </pic:nvPicPr>
                               <pic:blipFill>
-                                <a:blip r:embed="rId126" cstate="none"/>
+                                <a:blip r:embed="rId128" cstate="none"/>
                                 <a:srcRect/>
                                 <a:stretch>
                                   <a:fillRect/>
@@ -27318,7 +27529,7 @@
                                 </pic:cNvPicPr>
                               </pic:nvPicPr>
                               <pic:blipFill>
-                                <a:blip r:embed="rId127" cstate="none"/>
+                                <a:blip r:embed="rId129" cstate="none"/>
                                 <a:srcRect/>
                                 <a:stretch>
                                   <a:fillRect/>
@@ -27455,7 +27666,7 @@
                                 </pic:cNvPicPr>
                               </pic:nvPicPr>
                               <pic:blipFill>
-                                <a:blip r:embed="rId128" cstate="none"/>
+                                <a:blip r:embed="rId130" cstate="none"/>
                                 <a:srcRect/>
                                 <a:stretch>
                                   <a:fillRect/>
@@ -27594,7 +27805,7 @@
                                 </pic:cNvPicPr>
                               </pic:nvPicPr>
                               <pic:blipFill>
-                                <a:blip r:embed="rId129" cstate="none"/>
+                                <a:blip r:embed="rId131" cstate="none"/>
                                 <a:srcRect/>
                                 <a:stretch>
                                   <a:fillRect/>
@@ -27701,7 +27912,7 @@
                                 </pic:cNvPicPr>
                               </pic:nvPicPr>
                               <pic:blipFill>
-                                <a:blip r:embed="rId130" cstate="none"/>
+                                <a:blip r:embed="rId132" cstate="none"/>
                                 <a:srcRect/>
                                 <a:stretch>
                                   <a:fillRect/>
@@ -27840,7 +28051,7 @@
                                 </pic:cNvPicPr>
                               </pic:nvPicPr>
                               <pic:blipFill>
-                                <a:blip r:embed="rId131" cstate="none"/>
+                                <a:blip r:embed="rId133" cstate="none"/>
                                 <a:srcRect/>
                                 <a:stretch>
                                   <a:fillRect/>
@@ -27977,7 +28188,7 @@
                                 </pic:cNvPicPr>
                               </pic:nvPicPr>
                               <pic:blipFill>
-                                <a:blip r:embed="rId132" cstate="none"/>
+                                <a:blip r:embed="rId134" cstate="none"/>
                                 <a:srcRect/>
                                 <a:stretch>
                                   <a:fillRect/>
@@ -28116,7 +28327,7 @@
                                 </pic:cNvPicPr>
                               </pic:nvPicPr>
                               <pic:blipFill>
-                                <a:blip r:embed="rId133" cstate="none"/>
+                                <a:blip r:embed="rId135" cstate="none"/>
                                 <a:srcRect/>
                                 <a:stretch>
                                   <a:fillRect/>
@@ -28223,7 +28434,7 @@
                                 </pic:cNvPicPr>
                               </pic:nvPicPr>
                               <pic:blipFill>
-                                <a:blip r:embed="rId134" cstate="none"/>
+                                <a:blip r:embed="rId136" cstate="none"/>
                                 <a:srcRect/>
                                 <a:stretch>
                                   <a:fillRect/>
@@ -28362,7 +28573,7 @@
                                 </pic:cNvPicPr>
                               </pic:nvPicPr>
                               <pic:blipFill>
-                                <a:blip r:embed="rId135" cstate="none"/>
+                                <a:blip r:embed="rId137" cstate="none"/>
                                 <a:srcRect/>
                                 <a:stretch>
                                   <a:fillRect/>
@@ -28544,7 +28755,7 @@
                     </pic:cNvPicPr>
                   </pic:nvPicPr>
                   <pic:blipFill>
-                    <a:blip r:embed="rId136" cstate="none"/>
+                    <a:blip r:embed="rId138" cstate="none"/>
                     <a:srcRect/>
                     <a:stretch>
                       <a:fillRect/>

</xml_diff>